<commit_message>
Add publication type filters and update Space to Policy paper
- Added filter bar UI with buttons for Papers, Demos, Preprints, Thesis, and Interactive Articles
- Added data-type attributes to all 50+ paper entries for filtering
- Added JavaScript to handle filter clicks and update visibility of papers, separators, and year headers
- Updated Space to Policy paper with correct ACM published link (https://doi.org/10.1145/3736649) instead of arXiv
- Updated space2policy2025.bib with full ACM metadata (volume 3, issue 3, articleno 25)

🤖 Generated with [Claude Code](https://claude.com/claude-code)

Co-Authored-By: Claude Opus 4.5 <noreply@anthropic.com>
</commit_message>
<xml_diff>
--- a/papers/exports/all_publications.docx
+++ b/papers/exports/all_publications.docx
@@ -27,7 +27,7 @@
         <w:jc w:val="center"/>
       </w:pPr>
       <w:r>
-        <w:t>Generated: 2026-01-03 14:28:58</w:t>
+        <w:t>Generated: 2026-01-03 14:38:10</w:t>
         <w:br/>
       </w:r>
       <w:r>
@@ -191,7 +191,18 @@
         <w:rPr>
           <w:i/>
         </w:rPr>
-        <w:t>ACM Journal on Computing and Sustainable Societies (JCSS)</w:t>
+        <w:t>ACM J. Comput. Sustain. Soc.</w:t>
+      </w:r>
+    </w:p>
+    <w:p>
+      <w:r>
+        <w:rPr>
+          <w:b/>
+        </w:rPr>
+        <w:t xml:space="preserve">DOI: </w:t>
+      </w:r>
+      <w:r>
+        <w:t>10.1145/3736649</w:t>
       </w:r>
     </w:p>
     <w:p>
@@ -202,7 +213,7 @@
         <w:t xml:space="preserve">URL: </w:t>
       </w:r>
       <w:r>
-        <w:t>https://arxiv.org/abs/2412.04065</w:t>
+        <w:t>https://doi.org/10.1145/3736649</w:t>
       </w:r>
     </w:p>
     <w:p/>

</xml_diff>

<commit_message>
Add NILMBench2026 (BuildSys '26) and ThermEval (KDD '26) papers
NILMBench2026: a reproducible benchmark for energy disaggregation,
led by 2nd-year undergraduates Aayush Kuloor, Anurag Singh, and
Harsh Dhru. Modernises NILMTK to PyTorch + Docker + uv and evaluates
16 architectures across 3 datasets and 2 resolutions.

ThermEval: a structured benchmark for evaluating vision-language
models on thermal imagery (KDD '26). With Ayush Shrivastava,
Kirtan Gangani, Laksh Jain, and Mayank Goel (CMU).
</commit_message>
<xml_diff>
--- a/papers/exports/all_publications.docx
+++ b/papers/exports/all_publications.docx
@@ -27,11 +27,11 @@
         <w:jc w:val="center"/>
       </w:pPr>
       <w:r>
-        <w:t>Generated: 2026-01-03 14:38:10</w:t>
+        <w:t>Generated: 2026-05-18 09:22:17</w:t>
         <w:br/>
       </w:r>
       <w:r>
-        <w:t>Total Publications: 50</w:t>
+        <w:t>Total Publications: 52</w:t>
       </w:r>
     </w:p>
     <w:p>
@@ -47,6 +47,46 @@
         <w:t>2026</w:t>
       </w:r>
     </w:p>
+    <w:p>
+      <w:r>
+        <w:rPr>
+          <w:b/>
+        </w:rPr>
+        <w:t>ThermEval: A Structured Benchmark for Evaluation of</w:t>
+        <w:br/>
+        <w:t xml:space="preserve">         Vision-Language Models on Thermal Imagery</w:t>
+      </w:r>
+    </w:p>
+    <w:p>
+      <w:r>
+        <w:rPr>
+          <w:b/>
+        </w:rPr>
+        <w:t xml:space="preserve">Authors: </w:t>
+      </w:r>
+      <w:r>
+        <w:t>Shrivastava, Ayush and Gangani, Kirtan and Jain, Laksh and</w:t>
+        <w:br/>
+        <w:t xml:space="preserve">          Goel, Mayank and Batra, Nipun</w:t>
+      </w:r>
+    </w:p>
+    <w:p>
+      <w:r>
+        <w:rPr>
+          <w:b/>
+        </w:rPr>
+        <w:t xml:space="preserve">Venue: </w:t>
+      </w:r>
+      <w:r>
+        <w:rPr>
+          <w:i/>
+        </w:rPr>
+        <w:t>Proceedings of the 32nd ACM SIGKDD Conference on</w:t>
+        <w:br/>
+        <w:t xml:space="preserve">             Knowledge Discovery and Data Mining (KDD '26)</w:t>
+      </w:r>
+    </w:p>
+    <w:p/>
     <w:p>
       <w:r>
         <w:rPr>
@@ -82,6 +122,55 @@
         <w:t>Proceedings of the AAAI Conference on</w:t>
         <w:br/>
         <w:t xml:space="preserve">             Artificial Intelligence</w:t>
+      </w:r>
+    </w:p>
+    <w:p/>
+    <w:p>
+      <w:r>
+        <w:rPr>
+          <w:b/>
+        </w:rPr>
+        <w:t>NILMBench2026: A Benchmark for Energy Disaggregation</w:t>
+      </w:r>
+    </w:p>
+    <w:p>
+      <w:r>
+        <w:rPr>
+          <w:b/>
+        </w:rPr>
+        <w:t xml:space="preserve">Authors: </w:t>
+      </w:r>
+      <w:r>
+        <w:t>Kuloor, Aayush and Singh, Anurag and Dhru, Harsh and Batra, Nipun</w:t>
+      </w:r>
+    </w:p>
+    <w:p>
+      <w:r>
+        <w:rPr>
+          <w:b/>
+        </w:rPr>
+        <w:t xml:space="preserve">Venue: </w:t>
+      </w:r>
+      <w:r>
+        <w:rPr>
+          <w:i/>
+        </w:rPr>
+        <w:t>Proceedings of the 13th ACM International Conference on</w:t>
+        <w:br/>
+        <w:t xml:space="preserve">             Systems for Energy-Efficient Buildings, Cities, and</w:t>
+        <w:br/>
+        <w:t xml:space="preserve">             Transportation (BuildSys '26)</w:t>
+      </w:r>
+    </w:p>
+    <w:p>
+      <w:r>
+        <w:rPr>
+          <w:b/>
+        </w:rPr>
+        <w:t xml:space="preserve">DOI: </w:t>
+      </w:r>
+      <w:r>
+        <w:t>10.1145/3744256.3812587</w:t>
       </w:r>
     </w:p>
     <w:p/>

</xml_diff>